<commit_message>
Layout check: render full / empty / sparse / mixed DOCX through LibreOffice and verify; fix the redundant external heading
- test-render.mjs --pdf: converts 8 renders (private LibreOffice profile, so an open LibreOffice window doesn't swallow
  the request) and checks the laid-out text: no empty bullets, no orphan headings in the single-column external template
- fix: external 'Projects/Experience' heading now only shows when there are projects; with employers only, the
  'Experience' heading stands alone (was a heading pair with nothing between)
- removed the unused hasProjectsOrExperience flag; README documents npm run test:render
</commit_message>
<xml_diff>
--- a/public/templates/external.docx
+++ b/public/templates/external.docx
@@ -389,7 +389,7 @@
     </w:p>
     <w:p>
       <w:r>
-        <w:t xml:space="preserve">{#hasProjectsOrExperience}</w:t>
+        <w:t xml:space="preserve">{#hasProjects}</w:t>
       </w:r>
     </w:p>
     <w:p>
@@ -426,7 +426,7 @@
     </w:p>
     <w:p>
       <w:r>
-        <w:t xml:space="preserve">{/hasProjectsOrExperience}</w:t>
+        <w:t xml:space="preserve">{/hasProjects}</w:t>
       </w:r>
     </w:p>
     <w:p>

</xml_diff>

<commit_message>
Templates: logo keeps its aspect ratio and sits right under 'A PROUD MEMBER OF'
scripts/patch-optional-sections.py becomes scripts/patch-templates.py, still
one reproducible run from docs/template-backups (optional sections unchanged).
Logo: cropped exactly to the artwork (it was 15% transparent on the left and
right and slightly squashed) and drawn at the artwork's own ratio, 104pt wide;
its left edge and the label's are the same: internal on the sidebar column,
external flush with the right margin. The label lost its 10 tabs / 162 spaces
for a fixed indent; the logo is placed from its own cell / column and paragraph
(the same meaning in Word and LibreOffice) with no wrap distance above it.

test:render --pdf now converts exactly as Download PDF does (lib/pdfRender.ts)
and checks the logo: ratio in the XML, and on the PDF its left edge, gap under
the label and drawn ratio (216 dpi render).

Co-Authored-By: Claude Opus 5.5 <noreply@anthropic.com>
</commit_message>
<xml_diff>
--- a/public/templates/external.docx
+++ b/public/templates/external.docx
@@ -5,6 +5,8 @@
     <w:p>
       <w:pPr>
         <w:pStyle w:val="Heading3"/>
+        <w:ind w:left="7280" w:right="0" w:firstLine="0"/>
+        <w:jc w:val="left"/>
         <w:rPr/>
       </w:pPr>
       <w:bookmarkStart w:colFirst="0" w:colLast="0" w:name="_x8fm1uorkbaw" w:id="0"/>
@@ -13,7 +15,7 @@
         <w:rPr>
           <w:rtl w:val="0"/>
         </w:rPr>
-        <w:t xml:space="preserve">                                                                                                                                                                  A PROUD MEMBER OF </w:t>
+        <w:t xml:space="preserve">A PROUD MEMBER OF</w:t>
       </w:r>
     </w:p>
     <w:p>
@@ -31,17 +33,17 @@
       </w:r>
       <w:r>
         <w:drawing>
-          <wp:anchor allowOverlap="1" behindDoc="0" distB="114300" distT="114300" distL="114300" distR="114300" hidden="0" layoutInCell="1" locked="0" relativeHeight="0" simplePos="0">
+          <wp:anchor allowOverlap="1" behindDoc="0" distB="114300" distT="0" distL="114300" distR="114300" hidden="0" layoutInCell="1" locked="0" relativeHeight="0" simplePos="0">
             <wp:simplePos x="0" y="0"/>
             <wp:positionH relativeFrom="column">
-              <wp:posOffset>4327723</wp:posOffset>
+              <wp:posOffset>4622800</wp:posOffset>
             </wp:positionH>
             <wp:positionV relativeFrom="paragraph">
-              <wp:posOffset>123825</wp:posOffset>
+              <wp:posOffset>34290</wp:posOffset>
             </wp:positionV>
-            <wp:extent cx="1939727" cy="620713"/>
+            <wp:extent cx="1320800" cy="414891"/>
             <wp:effectExtent b="0" l="0" r="0" t="0"/>
-            <wp:wrapSquare wrapText="bothSides" distB="114300" distT="114300" distL="114300" distR="114300"/>
+            <wp:wrapSquare wrapText="bothSides" distB="114300" distT="0" distL="114300" distR="114300"/>
             <wp:docPr id="2" name="image2.png"/>
             <a:graphic>
               <a:graphicData uri="http://schemas.openxmlformats.org/drawingml/2006/picture">
@@ -52,7 +54,7 @@
                   </pic:nvPicPr>
                   <pic:blipFill>
                     <a:blip r:embed="rId6"/>
-                    <a:srcRect b="18103" l="0" r="0" t="18103"/>
+                    <a:srcRect l="15300" t="28200" r="15300" b="28200"/>
                     <a:stretch>
                       <a:fillRect/>
                     </a:stretch>
@@ -60,7 +62,7 @@
                   <pic:spPr>
                     <a:xfrm>
                       <a:off x="0" y="0"/>
-                      <a:ext cx="1939727" cy="620713"/>
+                      <a:ext cx="1320800" cy="414891"/>
                     </a:xfrm>
                     <a:prstGeom prst="rect"/>
                     <a:ln/>

</xml_diff>

<commit_message>
Templates: one bullet style; a blank line before the description and the bullets
Bullets: every responsibility (and external employer highlight) uses one
numbering definition: a Lexend '•' at text size (Lexend has no '●', which fell
back to whatever font the server had), 720/360 indent, 1.15 lines inside a
wrapped bullet and 1.5 lines from bullet to bullet. Before, internal used an
8pt and external a 9pt '●' with highlights on their own definition.

Internal projects get a blank line (same spacer as the project's others)
before the description and before the bullets; each goes away with its
section (new internal hasResponsibilities flag). External already had them.

test:render: XML checks for the bullet definition / indent / spacing, and on
the PDFs (incl. a new long-text case) bullet position, size, indent, 1.15 / 1.5
spacing and the blank lines.

Co-Authored-By: Claude Opus 5.5 <noreply@anthropic.com>
</commit_message>
<xml_diff>
--- a/public/templates/external.docx
+++ b/public/templates/external.docx
@@ -613,6 +613,7 @@
           <w:ilvl w:val="0"/>
           <w:numId w:val="1"/>
         </w:numPr>
+        <w:spacing w:before="0" w:after="96" w:line="276" w:lineRule="auto"/>
         <w:ind w:left="720" w:hanging="360"/>
         <w:rPr>
           <w:u w:val="none"/>
@@ -780,8 +781,9 @@
       <w:pPr>
         <w:numPr>
           <w:ilvl w:val="0"/>
-          <w:numId w:val="2"/>
+          <w:numId w:val="1"/>
         </w:numPr>
+        <w:spacing w:before="0" w:after="96" w:line="276" w:lineRule="auto"/>
         <w:ind w:left="720" w:hanging="360"/>
         <w:rPr/>
       </w:pPr>
@@ -929,14 +931,15 @@
     <w:lvl w:ilvl="0">
       <w:start w:val="1"/>
       <w:numFmt w:val="bullet"/>
-      <w:lvlText w:val="●"/>
+      <w:lvlText w:val="•"/>
       <w:lvlJc w:val="left"/>
       <w:pPr>
         <w:ind w:left="720" w:hanging="360"/>
       </w:pPr>
       <w:rPr>
-        <w:sz w:val="18"/>
-        <w:szCs w:val="18"/>
+        <w:rFonts w:ascii="Lexend" w:cs="Lexend" w:eastAsia="Lexend" w:hAnsi="Lexend"/>
+        <w:sz w:val="22"/>
+        <w:szCs w:val="22"/>
         <w:u w:val="none"/>
       </w:rPr>
     </w:lvl>
@@ -1041,14 +1044,15 @@
     <w:lvl w:ilvl="0">
       <w:start w:val="1"/>
       <w:numFmt w:val="bullet"/>
-      <w:lvlText w:val="●"/>
+      <w:lvlText w:val="•"/>
       <w:lvlJc w:val="left"/>
       <w:pPr>
         <w:ind w:left="720" w:hanging="360"/>
       </w:pPr>
       <w:rPr>
-        <w:sz w:val="18"/>
-        <w:szCs w:val="18"/>
+        <w:rFonts w:ascii="Lexend" w:cs="Lexend" w:eastAsia="Lexend" w:hAnsi="Lexend"/>
+        <w:sz w:val="22"/>
+        <w:szCs w:val="22"/>
         <w:u w:val="none"/>
       </w:rPr>
     </w:lvl>

</xml_diff>

<commit_message>
Templates: footer logo and page number placed as in the reference
Both templates get a generated footer: the logo (24.7 x 15.0pt) anchored to
the page 44.7pt from its left edge and 15.4pt above its bottom, and the page
number in Lexend 8.4pt in a page-anchored frame whose right edge mirrors the
logo (44.7pt from the right edge), digits centred on the logo's middle.
A .docx size is whole half-points, so 8.4pt is written like the reference,
as a superscript (14.5pt drawn at 58% by LibreOffice).

The old footer padded the number with Avenir bold spaces, which embedded a
DejaVu Sans fallback font in every PDF; that is gone.

scripts/pdf-measure.mjs reads fonts, sizes, baselines and image boxes with
pdf.js; test:render --pdf now checks the footer on every page of every render.

Co-Authored-By: Claude Opus 5.5 <noreply@anthropic.com>
</commit_message>
<xml_diff>
--- a/public/templates/external.docx
+++ b/public/templates/external.docx
@@ -829,33 +829,120 @@
 <w:ftr xmlns:mc="http://schemas.openxmlformats.org/markup-compatibility/2006" xmlns:o="urn:schemas-microsoft-com:office:office" xmlns:r="http://schemas.openxmlformats.org/officeDocument/2006/relationships" xmlns:m="http://schemas.openxmlformats.org/officeDocument/2006/math" xmlns:v="urn:schemas-microsoft-com:vml" xmlns:wp="http://schemas.openxmlformats.org/drawingml/2006/wordprocessingDrawing" xmlns:w10="urn:schemas-microsoft-com:office:word" xmlns:w="http://schemas.openxmlformats.org/wordprocessingml/2006/main" xmlns:wne="http://schemas.microsoft.com/office/word/2006/wordml" xmlns:sl="http://schemas.openxmlformats.org/schemaLibrary/2006/main" xmlns:a="http://schemas.openxmlformats.org/drawingml/2006/main" xmlns:pic="http://schemas.openxmlformats.org/drawingml/2006/picture" xmlns:c="http://schemas.openxmlformats.org/drawingml/2006/chart" xmlns:lc="http://schemas.openxmlformats.org/drawingml/2006/lockedCanvas" xmlns:dgm="http://schemas.openxmlformats.org/drawingml/2006/diagram" xmlns:wps="http://schemas.microsoft.com/office/word/2010/wordprocessingShape" xmlns:wpg="http://schemas.microsoft.com/office/word/2010/wordprocessingGroup" xmlns:w14="http://schemas.microsoft.com/office/word/2010/wordml" xmlns:w15="http://schemas.microsoft.com/office/word/2012/wordml" xmlns:w16="http://schemas.microsoft.com/office/word/2018/wordml" xmlns:w16cex="http://schemas.microsoft.com/office/word/2018/wordml/cex" xmlns:w16cid="http://schemas.microsoft.com/office/word/2016/wordml/cid" xmlns="http://schemas.microsoft.com/office/tasks/2019/documenttasks" xmlns:cr="http://schemas.microsoft.com/office/comments/2020/reactions">
   <w:p>
     <w:pPr>
-      <w:pStyle w:val="Heading2"/>
-      <w:rPr>
-        <w:sz w:val="26"/>
-        <w:szCs w:val="26"/>
+      <w:framePr w:w="800" w:h="240" w:hRule="exact" w:wrap="notBeside" w:vAnchor="page" w:hAnchor="page" w:x="10546" w:y="15370"/>
+      <w:spacing w:before="0" w:after="0" w:line="240" w:lineRule="exact"/>
+      <w:ind w:left="0" w:right="0" w:firstLine="0"/>
+      <w:jc w:val="right"/>
+      <w:rPr>
+        <w:rFonts w:ascii="Lexend" w:cs="Lexend" w:eastAsia="Lexend" w:hAnsi="Lexend"/>
+        <w:b w:val="0"/>
+        <w:bCs w:val="0"/>
+        <w:color w:val="231F20"/>
+        <w:sz w:val="29"/>
+        <w:szCs w:val="29"/>
+        <w:vertAlign w:val="superscript"/>
       </w:rPr>
     </w:pPr>
-    <w:bookmarkStart w:colFirst="0" w:colLast="0" w:name="_88evsads8s5f" w:id="14"/>
-    <w:bookmarkEnd w:id="14"/>
     <w:r>
       <w:rPr>
+        <w:rFonts w:ascii="Lexend" w:cs="Lexend" w:eastAsia="Lexend" w:hAnsi="Lexend"/>
+        <w:b w:val="0"/>
+        <w:bCs w:val="0"/>
+        <w:color w:val="231F20"/>
+        <w:sz w:val="29"/>
+        <w:szCs w:val="29"/>
         <w:vertAlign w:val="superscript"/>
       </w:rPr>
+      <w:fldChar w:fldCharType="begin"/>
+    </w:r>
+    <w:r>
+      <w:rPr>
+        <w:rFonts w:ascii="Lexend" w:cs="Lexend" w:eastAsia="Lexend" w:hAnsi="Lexend"/>
+        <w:b w:val="0"/>
+        <w:bCs w:val="0"/>
+        <w:color w:val="231F20"/>
+        <w:sz w:val="29"/>
+        <w:szCs w:val="29"/>
+        <w:vertAlign w:val="superscript"/>
+      </w:rPr>
+      <w:instrText xml:space="preserve"> PAGE </w:instrText>
+    </w:r>
+    <w:r>
+      <w:rPr>
+        <w:rFonts w:ascii="Lexend" w:cs="Lexend" w:eastAsia="Lexend" w:hAnsi="Lexend"/>
+        <w:b w:val="0"/>
+        <w:bCs w:val="0"/>
+        <w:color w:val="231F20"/>
+        <w:sz w:val="29"/>
+        <w:szCs w:val="29"/>
+        <w:vertAlign w:val="superscript"/>
+      </w:rPr>
+      <w:fldChar w:fldCharType="separate"/>
+    </w:r>
+    <w:r>
+      <w:rPr>
+        <w:rFonts w:ascii="Lexend" w:cs="Lexend" w:eastAsia="Lexend" w:hAnsi="Lexend"/>
+        <w:b w:val="0"/>
+        <w:bCs w:val="0"/>
+        <w:color w:val="231F20"/>
+        <w:sz w:val="29"/>
+        <w:szCs w:val="29"/>
+        <w:vertAlign w:val="superscript"/>
+      </w:rPr>
+      <w:t>1</w:t>
+    </w:r>
+    <w:r>
+      <w:rPr>
+        <w:rFonts w:ascii="Lexend" w:cs="Lexend" w:eastAsia="Lexend" w:hAnsi="Lexend"/>
+        <w:b w:val="0"/>
+        <w:bCs w:val="0"/>
+        <w:color w:val="231F20"/>
+        <w:sz w:val="29"/>
+        <w:szCs w:val="29"/>
+        <w:vertAlign w:val="superscript"/>
+      </w:rPr>
+      <w:fldChar w:fldCharType="end"/>
+    </w:r>
+  </w:p>
+  <w:p>
+    <w:pPr>
+      <w:spacing w:before="0" w:after="0" w:line="20" w:lineRule="exact"/>
+      <w:ind w:left="0" w:right="0" w:firstLine="0"/>
+      <w:jc w:val="left"/>
+      <w:rPr>
+        <w:sz w:val="2"/>
+        <w:szCs w:val="2"/>
+      </w:rPr>
+    </w:pPr>
+    <w:r>
+      <w:rPr>
+        <w:sz w:val="2"/>
+        <w:szCs w:val="2"/>
+      </w:rPr>
       <w:drawing>
-        <wp:inline distB="114300" distT="114300" distL="114300" distR="114300">
-          <wp:extent cx="314325" cy="190500"/>
-          <wp:effectExtent b="0" l="0" r="0" t="0"/>
-          <wp:docPr id="1" name="image1.jpg"/>
+        <wp:anchor distT="0" distB="0" distL="0" distR="0" simplePos="0" relativeHeight="1" behindDoc="0" locked="1" layoutInCell="1" allowOverlap="1">
+          <wp:simplePos x="0" y="0"/>
+          <wp:positionH relativeFrom="page">
+            <wp:posOffset>567690</wp:posOffset>
+          </wp:positionH>
+          <wp:positionV relativeFrom="page">
+            <wp:posOffset>9672320</wp:posOffset>
+          </wp:positionV>
+          <wp:extent cx="313690" cy="190500"/>
+          <wp:effectExtent l="0" t="0" r="0" b="0"/>
+          <wp:wrapNone/>
+          <wp:docPr id="101" name="footer logo"/>
+          <wp:cNvGraphicFramePr/>
           <a:graphic>
             <a:graphicData uri="http://schemas.openxmlformats.org/drawingml/2006/picture">
               <pic:pic>
                 <pic:nvPicPr>
-                  <pic:cNvPr id="0" name="image1.jpg"/>
+                  <pic:cNvPr id="0" name="footer logo"/>
                   <pic:cNvPicPr preferRelativeResize="0"/>
                 </pic:nvPicPr>
                 <pic:blipFill>
                   <a:blip r:embed="rId1"/>
-                  <a:srcRect b="0" l="0" r="0" t="0"/>
+                  <a:srcRect l="0" t="0" r="0" b="0"/>
                   <a:stretch>
                     <a:fillRect/>
                   </a:stretch>
@@ -863,7 +950,7 @@
                 <pic:spPr>
                   <a:xfrm>
                     <a:off x="0" y="0"/>
-                    <a:ext cx="314325" cy="190500"/>
+                    <a:ext cx="313690" cy="190500"/>
                   </a:xfrm>
                   <a:prstGeom prst="rect"/>
                   <a:ln/>
@@ -871,40 +958,8 @@
               </pic:pic>
             </a:graphicData>
           </a:graphic>
-        </wp:inline>
+        </wp:anchor>
       </w:drawing>
-    </w:r>
-    <w:r>
-      <w:rPr>
-        <w:vertAlign w:val="superscript"/>
-        <w:rtl w:val="0"/>
-      </w:rPr>
-      <w:t xml:space="preserve">                                                                                                                                                                                                                               </w:t>
-    </w:r>
-    <w:r>
-      <w:rPr>
-        <w:sz w:val="26"/>
-        <w:szCs w:val="26"/>
-        <w:vertAlign w:val="superscript"/>
-        <w:rtl w:val="0"/>
-      </w:rPr>
-      <w:t xml:space="preserve">   </w:t>
-    </w:r>
-    <w:r>
-      <w:rPr>
-        <w:sz w:val="26"/>
-        <w:szCs w:val="26"/>
-        <w:vertAlign w:val="superscript"/>
-      </w:rPr>
-      <w:fldChar w:fldCharType="begin"/>
-      <w:instrText xml:space="preserve">PAGE</w:instrText>
-      <w:fldChar w:fldCharType="separate"/>
-      <w:fldChar w:fldCharType="end"/>
-    </w:r>
-    <w:r>
-      <w:rPr>
-        <w:rtl w:val="0"/>
-      </w:rPr>
     </w:r>
   </w:p>
 </w:ftr>

</xml_diff>